<commit_message>
Remove Stamp-GPT mention from site and technical resume
Co-Authored-By: Claude Sonnet 5 <noreply@anthropic.com>
</commit_message>
<xml_diff>
--- a/public/resumes/brian-asimba-technical-resume.docx
+++ b/public/resumes/brian-asimba-technical-resume.docx
@@ -493,19 +493,6 @@
       </w:pPr>
       <w:r>
         <w:t>Built an automated pipeline extracting die surface data from NX Teamcenter for ML model training.</w:t>
-      </w:r>
-    </w:p>
-    <w:p>
-      <w:pPr>
-        <w:pStyle w:val="ListParagraph"/>
-        <w:numPr>
-          <w:ilvl w:val="0"/>
-          <w:numId w:val="2"/>
-        </w:numPr>
-        <w:spacing w:after="70"/>
-      </w:pPr>
-      <w:r>
-        <w:t>Built Stamp-GPT, a generative AI system for stamping tool design.</w:t>
       </w:r>
     </w:p>
     <w:p>

</xml_diff>